<commit_message>
Update document with revised content and formatting
</commit_message>
<xml_diff>
--- a/A题/设备检测.docx
+++ b/A题/设备检测.docx
@@ -440,7 +440,15 @@
           <w:szCs w:val="21"/>
           <w:lang w:bidi="ar"/>
         </w:rPr>
-        <w:t>进行1</w:t>
+        <w:t>进行</w:t>
+      </w:r>
+      <w:r>
+        <w:rPr>
+          <w:rFonts w:asciiTheme="minorEastAsia" w:eastAsiaTheme="minorEastAsia" w:hAnsiTheme="minorEastAsia" w:hint="eastAsia"/>
+          <w:szCs w:val="21"/>
+          <w:lang w:bidi="ar"/>
+        </w:rPr>
+        <w:t>0</w:t>
       </w:r>
       <w:r>
         <w:rPr>
@@ -777,7 +785,7 @@
         <w:ind w:left="840"/>
         <w:jc w:val="left"/>
         <w:rPr>
-          <w:rFonts w:asciiTheme="minorEastAsia" w:eastAsiaTheme="minorEastAsia" w:hAnsiTheme="minorEastAsia" w:hint="eastAsia"/>
+          <w:rFonts w:asciiTheme="minorEastAsia" w:eastAsiaTheme="minorEastAsia" w:hAnsiTheme="minorEastAsia"/>
           <w:szCs w:val="21"/>
         </w:rPr>
       </w:pPr>
@@ -954,7 +962,7 @@
         <w:spacing w:beforeLines="50" w:before="156" w:afterLines="50" w:after="156" w:line="276" w:lineRule="auto"/>
         <w:jc w:val="left"/>
         <w:rPr>
-          <w:rFonts w:asciiTheme="minorEastAsia" w:eastAsiaTheme="minorEastAsia" w:hAnsiTheme="minorEastAsia" w:hint="eastAsia"/>
+          <w:rFonts w:asciiTheme="minorEastAsia" w:eastAsiaTheme="minorEastAsia" w:hAnsiTheme="minorEastAsia"/>
           <w:szCs w:val="21"/>
         </w:rPr>
       </w:pPr>

</xml_diff>